<commit_message>
bench: record copulacci bounded retry
</commit_message>
<xml_diff>
--- a/benchmarking/cci_2026_atera/reports/topolink_cci_benchmark_manuscript_style_report.docx
+++ b/benchmarking/cci_2026_atera/reports/topolink_cci_benchmark_manuscript_style_report.docx
@@ -82,7 +82,7 @@
           <w:i w:val="0"/>
           <w:sz w:val="18"/>
         </w:rPr>
-        <w:t>，A100 无 active rescue process。报告口径已升级为 expanded 18-method benchmark：9 个 full success、7 个 bounded success、2 个 reproducible failure cards、0 个 deferred candidate methods、0 个 pending/running。这里的 all_methods_accounted=true 表示所有提到的方法都有明确状态，不表示所有方法都成功。</w:t>
+        <w:t>，A100 无 active rescue process。报告口径已升级为 expanded 18-method benchmark：9 个 full success、8 个 bounded success、1 个 reproducible failure card、0 个 deferred candidate methods、0 个 pending/running。这里的 all_methods_accounted=true 表示所有提到的方法都有明确状态，不表示所有方法都成功。</w:t>
       </w:r>
     </w:p>
     <w:p>
@@ -96,7 +96,7 @@
           <w:i w:val="0"/>
           <w:sz w:val="18"/>
         </w:rPr>
-        <w:t>FastCCC、SCILD、Copulacci 和 NicheNet 现在正式计入 expanded denominator，并且均已在 PDC 与 A100 完成终端化处理。FastCCC 和 SCILD 经 A100 retry 升级为 bounded subset result；Copulacci 和 NicheNet 保留 reproducible failure card，原因分别是 adapter workflow mapping blocker 与 R dependency/API audit blocker。</w:t>
+        <w:t>FastCCC、SCILD、Copulacci 和 NicheNet 现在正式计入 expanded denominator，并且均已在 PDC 与 A100 完成终端化处理。FastCCC、SCILD 和 Copulacci 经 A100 retry 升级为 bounded subset result；NicheNet 保留 reproducible failure card，原因是 R dependency/API audit blocker。</w:t>
       </w:r>
     </w:p>
     <w:p>
@@ -3128,15 +3128,15 @@
         <w:tc>
           <w:tcPr>
             <w:tcW w:type="dxa" w:w="1935"/>
-            <w:shd w:fill="F4CCCC"/>
-            <w:shd w:fill="F4CCCC"/>
+            <w:shd w:fill="FFF2CC"/>
+            <w:shd w:fill="FFF2CC"/>
             <w:vAlign w:val="top"/>
-            <w:shd w:fill="F4CCCC"/>
-            <w:shd w:fill="F4CCCC"/>
-            <w:shd w:fill="F4CCCC"/>
-            <w:shd w:fill="F4CCCC"/>
-            <w:shd w:fill="F4CCCC"/>
-            <w:shd w:fill="F4CCCC"/>
+            <w:shd w:fill="FFF2CC"/>
+            <w:shd w:fill="FFF2CC"/>
+            <w:shd w:fill="FFF2CC"/>
+            <w:shd w:fill="FFF2CC"/>
+            <w:shd w:fill="FFF2CC"/>
+            <w:shd w:fill="FFF2CC"/>
           </w:tcPr>
           <w:p>
             <w:pPr>
@@ -3149,7 +3149,7 @@
                 <w:b w:val="0"/>
                 <w:sz w:val="12"/>
               </w:rPr>
-              <w:t>Failure card</w:t>
+              <w:t>Bounded</w:t>
             </w:r>
           </w:p>
         </w:tc>
@@ -3169,7 +3169,7 @@
                 <w:b w:val="0"/>
                 <w:sz w:val="12"/>
               </w:rPr>
-              <w:t>Terminal card</w:t>
+              <w:t>Appendix</w:t>
             </w:r>
           </w:p>
         </w:tc>
@@ -3189,7 +3189,7 @@
                 <w:b w:val="0"/>
                 <w:sz w:val="12"/>
               </w:rPr>
-              <w:t>env/API audit</w:t>
+              <w:t>smoke20k</w:t>
             </w:r>
           </w:p>
         </w:tc>
@@ -3209,7 +3209,7 @@
                 <w:b w:val="0"/>
                 <w:sz w:val="12"/>
               </w:rPr>
-              <w:t>reported in artifact</w:t>
+              <w:t>13,981</w:t>
             </w:r>
           </w:p>
         </w:tc>
@@ -3229,7 +3229,7 @@
                 <w:b w:val="0"/>
                 <w:sz w:val="12"/>
               </w:rPr>
-              <w:t>PDC/A100</w:t>
+              <w:t>A100</w:t>
             </w:r>
           </w:p>
         </w:tc>
@@ -3249,7 +3249,7 @@
                 <w:b w:val="0"/>
                 <w:sz w:val="12"/>
               </w:rPr>
-              <w:t>Official source imports, but no safe common-resource bounded adapter mapping.</w:t>
+              <w:t>Official source-backed copulacci.model2.run_scc bounded retry; 50k expansion stopped for dense adjacency memory risk.</w:t>
             </w:r>
           </w:p>
         </w:tc>
@@ -4768,7 +4768,7 @@
           <w:i w:val="0"/>
           <w:sz w:val="18"/>
         </w:rPr>
-        <w:t>SCILD 已在官方 source 被重新确认后通过 A100 专用 Python 3.11 环境升级为 bounded subset result：3000 cells × 20 CCI pairs，2,880 rows，峰值内存约 18.9GB。Copulacci 和 NicheNet 是 expanded 18-method benchmark 中仍保留的 reproducible failure cards；Copulacci 官方 source 可安装和 import，但没有可安全映射到 common-resource benchmark 的 native bounded workflow；NicheNet 在 PDC 和 A100 均受 R dependency/API audit 约束，并且其定位更接近 downstream receiver-response support，而不是直接 spatial CCI ranker。FastCCC 已通过 A100 retry 产生 20k bounded standardized output。</w:t>
+        <w:t>SCILD 已在官方 source 被重新确认后通过 A100 专用 Python 3.11 环境升级为 bounded subset result：3000 cells × 20 CCI pairs，2,880 rows，峰值内存约 18.9GB。Copulacci 已通过官方 source-backed copulacci.model2.run_scc workflow 升级为 bounded subset result：20k cells × top 200 CCI pairs × top 80 celltype groups，13,981 rows；50k 扩容因 dense spatial adjacency memory risk 停止，因此不进入 full comparison。NicheNet 是 expanded 18-method benchmark 中仍保留的 reproducible failure card；它在 PDC 和 A100 均受 R dependency/API audit 约束，并且其定位更接近 downstream receiver-response support，而不是直接 spatial CCI ranker。FastCCC 已通过 A100 retry 产生 20k bounded standardized output。</w:t>
       </w:r>
     </w:p>
     <w:p>

</xml_diff>

<commit_message>
bench: upgrade nichenet bounded retry
</commit_message>
<xml_diff>
--- a/benchmarking/cci_2026_atera/reports/topolink_cci_benchmark_manuscript_style_report.docx
+++ b/benchmarking/cci_2026_atera/reports/topolink_cci_benchmark_manuscript_style_report.docx
@@ -82,7 +82,7 @@
           <w:i w:val="0"/>
           <w:sz w:val="18"/>
         </w:rPr>
-        <w:t>，A100 无 active rescue process。报告口径已升级为 expanded 18-method benchmark：9 个 full success、8 个 bounded success、1 个 reproducible failure card、0 个 deferred candidate methods、0 个 pending/running。这里的 all_methods_accounted=true 表示所有提到的方法都有明确状态，不表示所有方法都成功。</w:t>
+        <w:t>，A100 无 active rescue process。报告口径已升级为 expanded 18-method benchmark：9 个 full success、9 个 bounded success、0 个 reproducible failure card、0 个 deferred candidate methods、0 个 pending/running。这里的 all_methods_accounted=true 表示所有提到的方法都有明确终端状态。</w:t>
       </w:r>
     </w:p>
     <w:p>
@@ -96,7 +96,7 @@
           <w:i w:val="0"/>
           <w:sz w:val="18"/>
         </w:rPr>
-        <w:t>FastCCC、SCILD、Copulacci 和 NicheNet 现在正式计入 expanded denominator，并且均已在 PDC 与 A100 完成终端化处理。FastCCC、SCILD 和 Copulacci 经 A100 retry 升级为 bounded subset result；NicheNet 保留 reproducible failure card，原因是 R dependency/API audit blocker。</w:t>
+        <w:t>FastCCC、SCILD、Copulacci 和 NicheNet 现在正式计入 expanded denominator，并且均已在 PDC 与 A100 完成终端化处理。FastCCC、SCILD、Copulacci 和 NicheNet 均经 A100 retry 升级为 bounded subset result。</w:t>
       </w:r>
     </w:p>
     <w:p>
@@ -3298,15 +3298,15 @@
         <w:tc>
           <w:tcPr>
             <w:tcW w:type="dxa" w:w="1935"/>
-            <w:shd w:fill="F4CCCC"/>
-            <w:shd w:fill="F4CCCC"/>
+            <w:shd w:fill="FFF2CC"/>
+            <w:shd w:fill="FFF2CC"/>
             <w:vAlign w:val="top"/>
-            <w:shd w:fill="F4CCCC"/>
-            <w:shd w:fill="F4CCCC"/>
-            <w:shd w:fill="F4CCCC"/>
-            <w:shd w:fill="F4CCCC"/>
-            <w:shd w:fill="F4CCCC"/>
-            <w:shd w:fill="F4CCCC"/>
+            <w:shd w:fill="FFF2CC"/>
+            <w:shd w:fill="FFF2CC"/>
+            <w:shd w:fill="FFF2CC"/>
+            <w:shd w:fill="FFF2CC"/>
+            <w:shd w:fill="FFF2CC"/>
+            <w:shd w:fill="FFF2CC"/>
           </w:tcPr>
           <w:p>
             <w:pPr>
@@ -3319,7 +3319,7 @@
                 <w:b w:val="0"/>
                 <w:sz w:val="12"/>
               </w:rPr>
-              <w:t>Failure card</w:t>
+              <w:t>Bounded</w:t>
             </w:r>
           </w:p>
         </w:tc>
@@ -3339,7 +3339,7 @@
                 <w:b w:val="0"/>
                 <w:sz w:val="12"/>
               </w:rPr>
-              <w:t>Terminal card</w:t>
+              <w:t>Appendix</w:t>
             </w:r>
           </w:p>
         </w:tc>
@@ -3359,7 +3359,7 @@
                 <w:b w:val="0"/>
                 <w:sz w:val="12"/>
               </w:rPr>
-              <w:t>env/API audit</w:t>
+              <w:t>smoke20k</w:t>
             </w:r>
           </w:p>
         </w:tc>
@@ -3379,7 +3379,7 @@
                 <w:b w:val="0"/>
                 <w:sz w:val="12"/>
               </w:rPr>
-              <w:t>reported in artifact</w:t>
+              <w:t>215,542</w:t>
             </w:r>
           </w:p>
         </w:tc>
@@ -3399,7 +3399,7 @@
                 <w:b w:val="0"/>
                 <w:sz w:val="12"/>
               </w:rPr>
-              <w:t>PDC/A100</w:t>
+              <w:t>A100</w:t>
             </w:r>
           </w:p>
         </w:tc>
@@ -3419,7 +3419,7 @@
                 <w:b w:val="0"/>
                 <w:sz w:val="12"/>
               </w:rPr>
-              <w:t>R dependency/API audit blocker; downstream support method, not direct spatial CCI ranker.</w:t>
+              <w:t>Clean R retry with official nichenetr and Zenodo v2 ligand-target prior; downstream receiver-response support, not direct spatial CCI ranking.</w:t>
             </w:r>
           </w:p>
         </w:tc>
@@ -4768,7 +4768,7 @@
           <w:i w:val="0"/>
           <w:sz w:val="18"/>
         </w:rPr>
-        <w:t>SCILD 已在官方 source 被重新确认后通过 A100 专用 Python 3.11 环境升级为 bounded subset result：3000 cells × 20 CCI pairs，2,880 rows，峰值内存约 18.9GB。Copulacci 已通过官方 source-backed copulacci.model2.run_scc workflow 升级为 bounded subset result：20k cells × top 200 CCI pairs × top 80 celltype groups，13,981 rows；50k 扩容因 dense spatial adjacency memory risk 停止，因此不进入 full comparison。NicheNet 是 expanded 18-method benchmark 中仍保留的 reproducible failure card；它在 PDC 和 A100 均受 R dependency/API audit 约束，并且其定位更接近 downstream receiver-response support，而不是直接 spatial CCI ranker。FastCCC 已通过 A100 retry 产生 20k bounded standardized output。</w:t>
+        <w:t>SCILD 已在官方 source 被重新确认后通过 A100 专用 Python 3.11 环境升级为 bounded subset result：3000 cells × 20 CCI pairs，2,880 rows，峰值内存约 18.9GB。Copulacci 已通过官方 source-backed copulacci.model2.run_scc workflow 升级为 bounded subset result：20k cells × top 200 CCI pairs × top 80 celltype groups，13,981 rows；50k 扩容因 dense spatial adjacency memory risk 停止，因此不进入 full comparison。NicheNet 通过 clean A100 R retry、官方 saeyslab/nichenetr 包和 Zenodo v2 ligand-target prior 完成 20k downstream receiver-response support，产生 215,542 rows；该结果作为 downstream support appendix，不作为直接 spatial CCI ranker。FastCCC 已通过 A100 retry 产生 20k bounded standardized output。</w:t>
       </w:r>
     </w:p>
     <w:p>

</xml_diff>